<commit_message>
Record passing Oracle 11g execution in project reports
</commit_message>
<xml_diff>
--- a/docs/DETAILED_PROJECT_REPORT.docx
+++ b/docs/DETAILED_PROJECT_REPORT.docx
@@ -64,7 +64,7 @@
     </w:p>
     <w:p>
       <w:r>
-        <w:t xml:space="preserve">This report explains the implemented three-member prototype, traces the Review I requirements and Review II database criteria to working artifacts, and gives a repeatable demonstration workflow. The application has passed its automated checks on GitHub </w:t>
+        <w:t xml:space="preserve">This report explains the implemented three-member prototype, traces the Review I requirements and Review II database criteria to working artifacts, and gives a repeatable demonstration workflow. The integrated application and the separate Oracle 11g Review II script have passed live database checks on GitHub </w:t>
       </w:r>
       <w:r>
         <w:rPr>
@@ -74,7 +74,7 @@
         <w:t>main</w:t>
       </w:r>
       <w:r>
-        <w:t>. The separate Oracle 11g Review II script is prepared and checked structurally, but a live Oracle execution result has not yet been captured. This distinction matters for an honest final submission.</w:t>
+        <w:t>.</w:t>
       </w:r>
     </w:p>
     <w:p>
@@ -2158,30 +2158,41 @@
         <w:rPr>
           <w:b/>
         </w:rPr>
-        <w:t>has passed against PostgreSQL 16</w:t>
+        <w:t>passed against PostgreSQL 16</w:t>
       </w:r>
       <w:r>
-        <w:t xml:space="preserve"> in GitHub Actions. The Oracle SQL is a separate, one-time script for a clean Oracle 11g schema. Its object counts and structure have been checked in source, but no Oracle database execution is recorded yet. Run both </w:t>
+        <w:t xml:space="preserve"> in GitHub Actions. The separate Oracle scripts </w:t>
+      </w:r>
+      <w:r>
+        <w:rPr>
+          <w:b/>
+        </w:rPr>
+        <w:t>passed against Oracle XE 11g (11.2.0.2)</w:t>
+      </w:r>
+      <w:r>
+        <w:t xml:space="preserve"> in an isolated GitHub Actions container: </w:t>
+      </w:r>
+      <w:hyperlink r:id="rId9">
+        <w:r>
+          <w:rPr>
+            <w:color w:val="1E4E79"/>
+            <w:u w:val="single"/>
+          </w:rPr>
+          <w:t>Oracle execution run</w:t>
+        </w:r>
+      </w:hyperlink>
+      <w:r>
+        <w:t xml:space="preserve">. The Oracle run created a clean schema, executed the DDL, DML, PL/SQL and review queries, then printed </w:t>
       </w:r>
       <w:r>
         <w:rPr>
           <w:rFonts w:ascii="Consolas" w:hAnsi="Consolas"/>
           <w:sz w:val="18"/>
         </w:rPr>
-        <w:t>sql/review2_oracle11g.sql</w:t>
+        <w:t>REVIEW II ORACLE CHECKS PASSED</w:t>
       </w:r>
       <w:r>
-        <w:t xml:space="preserve"> and </w:t>
-      </w:r>
-      <w:r>
-        <w:rPr>
-          <w:rFonts w:ascii="Consolas" w:hAnsi="Consolas"/>
-          <w:sz w:val="18"/>
-        </w:rPr>
-        <w:t>sql/review2_oracle11g_verify.sql</w:t>
-      </w:r>
-      <w:r>
-        <w:t xml:space="preserve"> in SQL Developer and save the actual output before claiming an Oracle pass. The original Review I pages and the existing combined Review II PDF have not been edited for this report.</w:t>
+        <w:t>. It does not change the PostgreSQL application backend. The original Review I pages and the existing combined Review II PDF have not been edited for this report.</w:t>
       </w:r>
     </w:p>
     <w:p>
@@ -2313,7 +2324,7 @@
             <w:pPr>
               <w:spacing w:after="0" w:line="252" w:lineRule="auto"/>
             </w:pPr>
-            <w:hyperlink r:id="rId9">
+            <w:hyperlink r:id="rId10">
               <w:r>
                 <w:rPr>
                   <w:color w:val="1E4E79"/>
@@ -2640,7 +2651,7 @@
             <w:pPr>
               <w:spacing w:after="0" w:line="252" w:lineRule="auto"/>
             </w:pPr>
-            <w:hyperlink r:id="rId10">
+            <w:hyperlink r:id="rId11">
               <w:r>
                 <w:rPr>
                   <w:color w:val="1E4E79"/>
@@ -2649,6 +2660,68 @@
                 <w:t>Member 1 CI on main</w:t>
               </w:r>
             </w:hyperlink>
+          </w:p>
+        </w:tc>
+      </w:tr>
+      <w:tr>
+        <w:tc>
+          <w:tcPr>
+            <w:tcW w:type="dxa" w:w="1872"/>
+            <w:vAlign w:val="top"/>
+          </w:tcPr>
+          <w:p>
+            <w:pPr>
+              <w:spacing w:after="0" w:line="252" w:lineRule="auto"/>
+            </w:pPr>
+            <w:r>
+              <w:rPr>
+                <w:sz w:val="16"/>
+              </w:rPr>
+              <w:t>Oracle 11g Review II</w:t>
+            </w:r>
+          </w:p>
+        </w:tc>
+        <w:tc>
+          <w:tcPr>
+            <w:tcW w:type="dxa" w:w="5256"/>
+            <w:vAlign w:val="top"/>
+          </w:tcPr>
+          <w:p>
+            <w:pPr>
+              <w:spacing w:after="0" w:line="252" w:lineRule="auto"/>
+            </w:pPr>
+            <w:r>
+              <w:rPr>
+                <w:sz w:val="16"/>
+              </w:rPr>
+              <w:t>12 tables, 10 logs, 5 valid PL/SQL objects, failed-login function, cursor replay, alert/incident triggers, and DML checks passed</w:t>
+            </w:r>
+          </w:p>
+        </w:tc>
+        <w:tc>
+          <w:tcPr>
+            <w:tcW w:type="dxa" w:w="3182"/>
+            <w:vAlign w:val="top"/>
+          </w:tcPr>
+          <w:p>
+            <w:pPr>
+              <w:spacing w:after="0" w:line="252" w:lineRule="auto"/>
+            </w:pPr>
+            <w:hyperlink r:id="rId9">
+              <w:r>
+                <w:rPr>
+                  <w:color w:val="1E4E79"/>
+                  <w:u w:val="single"/>
+                </w:rPr>
+                <w:t>Oracle 11g CI on main</w:t>
+              </w:r>
+            </w:hyperlink>
+            <w:r>
+              <w:rPr>
+                <w:sz w:val="16"/>
+              </w:rPr>
+              <w:t>, including downloadable SQL*Plus output</w:t>
+            </w:r>
           </w:p>
         </w:tc>
       </w:tr>
@@ -2680,7 +2753,7 @@
       <w:r>
         <w:t xml:space="preserve">; the query plan examined 50 versus 1,000,000 documents. This is about 475 times faster for that query and runner, not a universal system-wide speed guarantee. See </w:t>
       </w:r>
-      <w:hyperlink r:id="rId11">
+      <w:hyperlink r:id="rId12">
         <w:r>
           <w:rPr>
             <w:color w:val="1E4E79"/>
@@ -3130,7 +3203,7 @@
         <w:t xml:space="preserve">9. </w:t>
       </w:r>
       <w:r>
-        <w:t>If faculty asks for Oracle PL/SQL, run the separate Oracle script and verification script in a clean Oracle 11g schema. Show actual output, not the expected values printed in the Review II PDF.</w:t>
+        <w:t>Show the passing Oracle 11g CI run and its SQL*Plus output. If faculty wants a live lab demonstration, run the separate Oracle setup and verification scripts in a clean schema using the guide.</w:t>
       </w:r>
     </w:p>
     <w:p>
@@ -3143,16 +3216,7 @@
     </w:p>
     <w:p>
       <w:r>
-        <w:t xml:space="preserve">Within the Review I academic prototype scope, the integrated application and PostgreSQL Review II demonstration are implemented and passing. The Oracle 11g coursework artifact is prepared and packaged with a deterministic verification script. </w:t>
-      </w:r>
-      <w:r>
-        <w:rPr>
-          <w:b/>
-        </w:rPr>
-        <w:t>An Oracle execution record is still required to state that the Oracle path is verified.</w:t>
-      </w:r>
-      <w:r>
-        <w:t xml:space="preserve"> The project does not include enterprise deployment or trained ML because those were outside the stated scope.</w:t>
+        <w:t>Within the stated Review I academic prototype scope, the integrated application, million-log benchmark, PostgreSQL Review II demonstration, and separate Oracle 11g coursework demonstration are implemented and passing. The Oracle evidence is a live CI run of XE 11g, not a claim that the FastAPI application uses Oracle. The project does not include enterprise deployment or trained ML because those were outside the stated scope. A faculty evaluation and any requested live presentation remain external academic steps.</w:t>
       </w:r>
     </w:p>
     <w:p>
@@ -3160,12 +3224,99 @@
         <w:pStyle w:val="Heading1"/>
       </w:pPr>
       <w:r>
-        <w:t>11. Oracle lab execution record</w:t>
+        <w:t>11. Oracle 11g execution record and lab replay</w:t>
       </w:r>
     </w:p>
     <w:p>
       <w:r>
-        <w:t xml:space="preserve">The Oracle path needs one clean run in your accessible Oracle 11g environment. Use a dedicated schema so the one-time DDL cannot collide with unrelated tables. In SQL Developer, open </w:t>
+        <w:t xml:space="preserve">The </w:t>
+      </w:r>
+      <w:hyperlink r:id="rId9">
+        <w:r>
+          <w:rPr>
+            <w:color w:val="1E4E79"/>
+            <w:u w:val="single"/>
+          </w:rPr>
+          <w:t>Oracle 11g GitHub Actions run</w:t>
+        </w:r>
+      </w:hyperlink>
+      <w:r>
+        <w:t xml:space="preserve"> succeeded on commit </w:t>
+      </w:r>
+      <w:r>
+        <w:rPr>
+          <w:rFonts w:ascii="Consolas" w:hAnsi="Consolas"/>
+          <w:sz w:val="18"/>
+        </w:rPr>
+        <w:t>e86bb94</w:t>
+      </w:r>
+      <w:r>
+        <w:t xml:space="preserve">. Its </w:t>
+      </w:r>
+      <w:r>
+        <w:rPr>
+          <w:rFonts w:ascii="Consolas" w:hAnsi="Consolas"/>
+          <w:sz w:val="18"/>
+        </w:rPr>
+        <w:t>oracle-11g</w:t>
+      </w:r>
+      <w:r>
+        <w:t xml:space="preserve"> job started Oracle XE 11.2.0.2, created a dedicated </w:t>
+      </w:r>
+      <w:r>
+        <w:rPr>
+          <w:rFonts w:ascii="Consolas" w:hAnsi="Consolas"/>
+          <w:sz w:val="18"/>
+        </w:rPr>
+        <w:t>review2_ci</w:t>
+      </w:r>
+      <w:r>
+        <w:t xml:space="preserve"> schema, ran </w:t>
+      </w:r>
+      <w:r>
+        <w:rPr>
+          <w:rFonts w:ascii="Consolas" w:hAnsi="Consolas"/>
+          <w:sz w:val="18"/>
+        </w:rPr>
+        <w:t>sql/review2_oracle11g.sql</w:t>
+      </w:r>
+      <w:r>
+        <w:t xml:space="preserve"> and </w:t>
+      </w:r>
+      <w:r>
+        <w:rPr>
+          <w:rFonts w:ascii="Consolas" w:hAnsi="Consolas"/>
+          <w:sz w:val="18"/>
+        </w:rPr>
+        <w:t>sql/review2_oracle11g_verify.sql</w:t>
+      </w:r>
+      <w:r>
+        <w:t xml:space="preserve"> through SQL*Plus, and uploaded the setup and verification output as an artifact. The output includes </w:t>
+      </w:r>
+      <w:r>
+        <w:rPr>
+          <w:rFonts w:ascii="Consolas" w:hAnsi="Consolas"/>
+          <w:sz w:val="18"/>
+        </w:rPr>
+        <w:t>Failed login count = 3</w:t>
+      </w:r>
+      <w:r>
+        <w:t xml:space="preserve"> and </w:t>
+      </w:r>
+      <w:r>
+        <w:rPr>
+          <w:rFonts w:ascii="Consolas" w:hAnsi="Consolas"/>
+          <w:sz w:val="18"/>
+        </w:rPr>
+        <w:t>REVIEW II ORACLE CHECKS PASSED</w:t>
+      </w:r>
+      <w:r>
+        <w:t>. The verifier checks 12 tables, 10 sample logs, zero compilation errors, five valid PL/SQL objects, a deduplicated alert, a linked incident, the DELETE demonstration, and the resolved-time trigger.</w:t>
+      </w:r>
+    </w:p>
+    <w:p>
+      <w:r>
+        <w:t xml:space="preserve">For a lab replay, use a dedicated clean Oracle 11g schema so the one-time DDL cannot collide with unrelated tables. In SQL Developer, open </w:t>
       </w:r>
       <w:r>
         <w:rPr>
@@ -3184,12 +3335,7 @@
         <w:t>Run Script (F5)</w:t>
       </w:r>
       <w:r>
-        <w:t>. Confirm the 12 tables, four indexes, two triggers, one function, and two procedures compile without errors. The script inserts the synthetic records and runs the six review queries.</w:t>
-      </w:r>
-    </w:p>
-    <w:p>
-      <w:r>
-        <w:t xml:space="preserve">Next, run </w:t>
+        <w:t xml:space="preserve">. Then run </w:t>
       </w:r>
       <w:r>
         <w:rPr>
@@ -3199,22 +3345,12 @@
         <w:t>sql/review2_oracle11g_verify.sql</w:t>
       </w:r>
       <w:r>
-        <w:t xml:space="preserve"> in the same connection. A passing run prints </w:t>
-      </w:r>
-      <w:r>
-        <w:rPr>
-          <w:rFonts w:ascii="Consolas" w:hAnsi="Consolas"/>
-          <w:sz w:val="18"/>
-        </w:rPr>
-        <w:t>REVIEW II ORACLE CHECKS PASSED</w:t>
-      </w:r>
-      <w:r>
-        <w:t>; it also checks the failed-login count of three, one alert after detection replay, linked incident creation, DELETE behavior, and resolved-time trigger. The verification rolls back its temporary incident update. Capture the script output, any compilation messages, and representative query result screens for the faculty review.</w:t>
+        <w:t xml:space="preserve"> in the same connection. The verifier rolls back its temporary incident update. Save the actual output and representative query result screens for the faculty review.</w:t>
       </w:r>
     </w:p>
     <w:p>
       <w:r>
-        <w:t xml:space="preserve">If either script reports an </w:t>
+        <w:t xml:space="preserve">If a lab run reports an </w:t>
       </w:r>
       <w:r>
         <w:rPr>
@@ -3234,12 +3370,12 @@
         <w:t>PLS-</w:t>
       </w:r>
       <w:r>
-        <w:t xml:space="preserve"> error, record the exact message and line number, repair the script, then repeat from a clean schema. The expected values printed in the existing Review II PDF are not a substitute for actual execution output. Keep database passwords out of screenshots, the repository, and this report.</w:t>
+        <w:t xml:space="preserve"> error, capture the exact message and line number and repeat from a clean schema after repair. Keep database passwords out of screenshots and the report.</w:t>
       </w:r>
     </w:p>
     <w:sectPr>
-      <w:headerReference w:type="default" r:id="rId12"/>
-      <w:footerReference w:type="default" r:id="rId13"/>
+      <w:headerReference w:type="default" r:id="rId13"/>
+      <w:footerReference w:type="default" r:id="rId14"/>
       <w:pgSz w:w="12240" w:h="15840"/>
       <w:pgMar w:top="1080" w:right="1152" w:bottom="1008" w:left="1152" w:header="720" w:footer="720" w:gutter="0"/>
       <w:cols w:space="720"/>

</xml_diff>